<commit_message>
feat(admin): export all five document types from the original Word templates
- Add tagged templates for external, external (circular) and order; memo templates now show the
  letterhead on the first page of each letter only (titlePg) and use one section per recipient
- Keep the original leading paragraphs (floating garuda, blank lines) so the letterhead lands where
  the original does; page bottom margin stays 2.0 cm
- Circulars: one letter per recipient in a single file (loop + page break or section break)
- E-signature image is embedded into the template package; repeated drawings get unique ids
- Build all content (rich body, committee rows, signature, coordinator) as WordprocessingML
- Add test group 19; memo (circular) follows the original which has no footer code

Co-Authored-By: Claude Sonnet 5.5 <noreply@anthropic.com>
</commit_message>
<xml_diff>
--- a/public/templates/admin/word/memo.docx
+++ b/public/templates/admin/word/memo.docx
@@ -2,6 +2,11 @@
 <file path=word/document.xml><?xml version="1.0" encoding="utf-8"?>
 <w:document xmlns:wpc="http://schemas.microsoft.com/office/word/2010/wordprocessingCanvas" xmlns:cx="http://schemas.microsoft.com/office/drawing/2014/chartex" xmlns:cx1="http://schemas.microsoft.com/office/drawing/2015/9/8/chartex" xmlns:cx2="http://schemas.microsoft.com/office/drawing/2015/10/21/chartex" xmlns:cx3="http://schemas.microsoft.com/office/drawing/2016/5/9/chartex" xmlns:cx4="http://schemas.microsoft.com/office/drawing/2016/5/10/chartex" xmlns:cx5="http://schemas.microsoft.com/office/drawing/2016/5/11/chartex" xmlns:cx6="http://schemas.microsoft.com/office/drawing/2016/5/12/chartex" xmlns:cx7="http://schemas.microsoft.com/office/drawing/2016/5/13/chartex" xmlns:cx8="http://schemas.microsoft.com/office/drawing/2016/5/14/chartex" xmlns:mc="http://schemas.openxmlformats.org/markup-compatibility/2006" xmlns:aink="http://schemas.microsoft.com/office/drawing/2016/ink" xmlns:am3d="http://schemas.microsoft.com/office/drawing/2017/model3d" xmlns:o="urn:schemas-microsoft-com:office:office" xmlns:oel="http://schemas.microsoft.com/office/2019/extlst" xmlns:r="http://schemas.openxmlformats.org/officeDocument/2006/relationships" xmlns:m="http://schemas.openxmlformats.org/officeDocument/2006/math" xmlns:v="urn:schemas-microsoft-com:vml" xmlns:wp14="http://schemas.microsoft.com/office/word/2010/wordprocessingDrawing" xmlns:wp="http://schemas.openxmlformats.org/drawingml/2006/wordprocessingDrawing" xmlns:w10="urn:schemas-microsoft-com:office:word" xmlns:w="http://schemas.openxmlformats.org/wordprocessingml/2006/main" xmlns:w14="http://schemas.microsoft.com/office/word/2010/wordml" xmlns:w15="http://schemas.microsoft.com/office/word/2012/wordml" xmlns:w16cex="http://schemas.microsoft.com/office/word/2018/wordml/cex" xmlns:w16cid="http://schemas.microsoft.com/office/word/2016/wordml/cid" xmlns:w16="http://schemas.microsoft.com/office/word/2018/wordml" xmlns:w16du="http://schemas.microsoft.com/office/word/2023/wordml/word16du" xmlns:w16sdtdh="http://schemas.microsoft.com/office/word/2020/wordml/sdtdatahash" xmlns:w16sdtfl="http://schemas.microsoft.com/office/word/2024/wordml/sdtformatlock" xmlns:w16se="http://schemas.microsoft.com/office/word/2015/wordml/symex" xmlns:wpg="http://schemas.microsoft.com/office/word/2010/wordprocessingGroup" xmlns:wpi="http://schemas.microsoft.com/office/word/2010/wordprocessingInk" xmlns:wne="http://schemas.microsoft.com/office/word/2006/wordml" xmlns:wps="http://schemas.microsoft.com/office/word/2010/wordprocessingShape" mc:Ignorable="w14 w15 w16se w16cid w16 w16cex w16sdtdh w16sdtfl w16du wp14">
   <w:body>
+    <w:p>
+      <w:r>
+        <w:t xml:space="preserve">{{#letters}}</w:t>
+      </w:r>
+    </w:p>
     <w:p>
       <w:pPr>
         <w:tabs>
@@ -35,63 +40,64 @@
       </w:r>
     </w:p>
     <w:p>
-      <w:pPr>
-        <w:spacing w:after="0" w:line="240" w:lineRule="auto"/>
-      </w:pPr>
       <w:r>
-        <w:rPr>
-          <w:rFonts w:ascii="TH SarabunIT๙" w:hAnsi="TH SarabunIT๙" w:cs="TH SarabunIT๙"/>
-          <w:sz w:val="32"/>
-          <w:szCs w:val="32"/>
-        </w:rPr>
         <w:t xml:space="preserve">{{@extra}}</w:t>
       </w:r>
     </w:p>
     <w:p>
-      <w:pPr>
-        <w:spacing w:after="0" w:line="240" w:lineRule="auto"/>
-      </w:pPr>
       <w:r>
-        <w:rPr>
-          <w:rFonts w:ascii="TH SarabunIT๙" w:hAnsi="TH SarabunIT๙" w:cs="TH SarabunIT๙"/>
-          <w:sz w:val="32"/>
-          <w:szCs w:val="32"/>
-        </w:rPr>
         <w:t xml:space="preserve">{{@body}}</w:t>
       </w:r>
     </w:p>
     <w:p>
-      <w:pPr>
-        <w:spacing w:after="0" w:line="240" w:lineRule="auto"/>
-      </w:pPr>
       <w:r>
-        <w:rPr>
-          <w:rFonts w:ascii="TH SarabunIT๙" w:hAnsi="TH SarabunIT๙" w:cs="TH SarabunIT๙"/>
-          <w:sz w:val="32"/>
-          <w:szCs w:val="32"/>
-        </w:rPr>
         <w:t xml:space="preserve">{{@signature}}</w:t>
       </w:r>
     </w:p>
     <w:p>
-      <w:pPr>
-        <w:spacing w:after="0" w:line="240" w:lineRule="auto"/>
-      </w:pPr>
       <w:r>
-        <w:rPr>
-          <w:rFonts w:ascii="TH SarabunIT๙" w:hAnsi="TH SarabunIT๙" w:cs="TH SarabunIT๙"/>
-          <w:sz w:val="32"/>
-          <w:szCs w:val="32"/>
-        </w:rPr>
         <w:t xml:space="preserve">{{@coordinator}}</w:t>
       </w:r>
     </w:p>
+    <w:p>
+      <w:r>
+        <w:t xml:space="preserve">{{#notLast}}</w:t>
+      </w:r>
+    </w:p>
+    <w:p>
+      <w:pPr>
+        <w:sectPr>
+          <w:headerReference w:type="default" r:id="rIdHdrBlank"/>
+          <w:headerReference w:type="first" r:id="rId7"/>
+          <w:footerReference w:type="default" r:id="rId8"/>
+          <w:footerReference w:type="first" r:id="rIdFtrFirst"/>
+          <w:pgSz w:w="11906" w:h="16838"/>
+          <w:pgMar w:top="1418" w:right="1134" w:bottom="1276" w:left="1701" w:header="850" w:footer="850" w:gutter="0"/>
+          <w:cols w:space="720"/>
+          <w:titlePg/>
+          <w:docGrid w:linePitch="360"/>
+        </w:sectPr>
+      </w:pPr>
+    </w:p>
+    <w:p>
+      <w:r>
+        <w:t xml:space="preserve">{{/notLast}}</w:t>
+      </w:r>
+    </w:p>
+    <w:p>
+      <w:r>
+        <w:t xml:space="preserve">{{/letters}}</w:t>
+      </w:r>
+    </w:p>
     <w:sectPr>
-      <w:headerReference w:type="default" r:id="rId7"/>
+      <w:headerReference w:type="default" r:id="rIdHdrBlank"/>
+      <w:headerReference w:type="first" r:id="rId7"/>
       <w:footerReference w:type="default" r:id="rId8"/>
+      <w:footerReference w:type="first" r:id="rIdFtrFirst"/>
       <w:pgSz w:w="11906" w:h="16838"/>
       <w:pgMar w:top="1418" w:right="1134" w:bottom="1276" w:left="1701" w:header="850" w:footer="850" w:gutter="0"/>
       <w:cols w:space="720"/>
+      <w:titlePg/>
       <w:docGrid w:linePitch="360"/>
     </w:sectPr>
   </w:body>
@@ -124,6 +130,45 @@
 </file>
 
 <file path=word/footer1.xml><?xml version="1.0" encoding="utf-8"?>
+<w:ftr xmlns:wpc="http://schemas.microsoft.com/office/word/2010/wordprocessingCanvas" xmlns:cx="http://schemas.microsoft.com/office/drawing/2014/chartex" xmlns:cx1="http://schemas.microsoft.com/office/drawing/2015/9/8/chartex" xmlns:cx2="http://schemas.microsoft.com/office/drawing/2015/10/21/chartex" xmlns:cx3="http://schemas.microsoft.com/office/drawing/2016/5/9/chartex" xmlns:cx4="http://schemas.microsoft.com/office/drawing/2016/5/10/chartex" xmlns:cx5="http://schemas.microsoft.com/office/drawing/2016/5/11/chartex" xmlns:cx6="http://schemas.microsoft.com/office/drawing/2016/5/12/chartex" xmlns:cx7="http://schemas.microsoft.com/office/drawing/2016/5/13/chartex" xmlns:cx8="http://schemas.microsoft.com/office/drawing/2016/5/14/chartex" xmlns:mc="http://schemas.openxmlformats.org/markup-compatibility/2006" xmlns:aink="http://schemas.microsoft.com/office/drawing/2016/ink" xmlns:am3d="http://schemas.microsoft.com/office/drawing/2017/model3d" xmlns:o="urn:schemas-microsoft-com:office:office" xmlns:oel="http://schemas.microsoft.com/office/2019/extlst" xmlns:r="http://schemas.openxmlformats.org/officeDocument/2006/relationships" xmlns:m="http://schemas.openxmlformats.org/officeDocument/2006/math" xmlns:v="urn:schemas-microsoft-com:vml" xmlns:wp14="http://schemas.microsoft.com/office/word/2010/wordprocessingDrawing" xmlns:wp="http://schemas.openxmlformats.org/drawingml/2006/wordprocessingDrawing" xmlns:w10="urn:schemas-microsoft-com:office:word" xmlns:w="http://schemas.openxmlformats.org/wordprocessingml/2006/main" xmlns:w14="http://schemas.microsoft.com/office/word/2010/wordml" xmlns:w15="http://schemas.microsoft.com/office/word/2012/wordml" xmlns:w16cex="http://schemas.microsoft.com/office/word/2018/wordml/cex" xmlns:w16cid="http://schemas.microsoft.com/office/word/2016/wordml/cid" xmlns:w16="http://schemas.microsoft.com/office/word/2018/wordml" xmlns:w16du="http://schemas.microsoft.com/office/word/2023/wordml/word16du" xmlns:w16sdtdh="http://schemas.microsoft.com/office/word/2020/wordml/sdtdatahash" xmlns:w16sdtfl="http://schemas.microsoft.com/office/word/2024/wordml/sdtformatlock" xmlns:w16se="http://schemas.microsoft.com/office/word/2015/wordml/symex" xmlns:wpg="http://schemas.microsoft.com/office/word/2010/wordprocessingGroup" xmlns:wpi="http://schemas.microsoft.com/office/word/2010/wordprocessingInk" xmlns:wne="http://schemas.microsoft.com/office/word/2006/wordml" xmlns:wps="http://schemas.microsoft.com/office/word/2010/wordprocessingShape" mc:Ignorable="w14 w15 w16se w16cid w16 w16cex w16sdtdh w16sdtfl w16du wp14">
+  <w:p>
+    <w:pPr>
+      <w:pStyle w:val="a8"/>
+    </w:pPr>
+    <w:r>
+      <w:t>CPRU-66-001</w:t>
+    </w:r>
+    <w:r>
+      <w:ptab w:relativeTo="margin" w:alignment="center" w:leader="none"/>
+    </w:r>
+    <w:r>
+      <w:ptab w:relativeTo="margin" w:alignment="right" w:leader="none"/>
+    </w:r>
+    <w:r>
+      <w:fldChar w:fldCharType="begin"/>
+    </w:r>
+    <w:r>
+      <w:instrText xml:space="preserve"> PAGE   \* MERGEFORMAT </w:instrText>
+    </w:r>
+    <w:r>
+      <w:fldChar w:fldCharType="separate"/>
+    </w:r>
+    <w:r>
+      <w:t>1</w:t>
+    </w:r>
+    <w:r>
+      <w:fldChar w:fldCharType="end"/>
+    </w:r>
+  </w:p>
+  <w:p>
+    <w:pPr>
+      <w:pStyle w:val="a8"/>
+    </w:pPr>
+  </w:p>
+</w:ftr>
+</file>
+
+<file path=word/footerFirst.xml><?xml version="1.0" encoding="utf-8"?>
 <w:ftr xmlns:wpc="http://schemas.microsoft.com/office/word/2010/wordprocessingCanvas" xmlns:cx="http://schemas.microsoft.com/office/drawing/2014/chartex" xmlns:cx1="http://schemas.microsoft.com/office/drawing/2015/9/8/chartex" xmlns:cx2="http://schemas.microsoft.com/office/drawing/2015/10/21/chartex" xmlns:cx3="http://schemas.microsoft.com/office/drawing/2016/5/9/chartex" xmlns:cx4="http://schemas.microsoft.com/office/drawing/2016/5/10/chartex" xmlns:cx5="http://schemas.microsoft.com/office/drawing/2016/5/11/chartex" xmlns:cx6="http://schemas.microsoft.com/office/drawing/2016/5/12/chartex" xmlns:cx7="http://schemas.microsoft.com/office/drawing/2016/5/13/chartex" xmlns:cx8="http://schemas.microsoft.com/office/drawing/2016/5/14/chartex" xmlns:mc="http://schemas.openxmlformats.org/markup-compatibility/2006" xmlns:aink="http://schemas.microsoft.com/office/drawing/2016/ink" xmlns:am3d="http://schemas.microsoft.com/office/drawing/2017/model3d" xmlns:o="urn:schemas-microsoft-com:office:office" xmlns:oel="http://schemas.microsoft.com/office/2019/extlst" xmlns:r="http://schemas.openxmlformats.org/officeDocument/2006/relationships" xmlns:m="http://schemas.openxmlformats.org/officeDocument/2006/math" xmlns:v="urn:schemas-microsoft-com:vml" xmlns:wp14="http://schemas.microsoft.com/office/word/2010/wordprocessingDrawing" xmlns:wp="http://schemas.openxmlformats.org/drawingml/2006/wordprocessingDrawing" xmlns:w10="urn:schemas-microsoft-com:office:word" xmlns:w="http://schemas.openxmlformats.org/wordprocessingml/2006/main" xmlns:w14="http://schemas.microsoft.com/office/word/2010/wordml" xmlns:w15="http://schemas.microsoft.com/office/word/2012/wordml" xmlns:w16cex="http://schemas.microsoft.com/office/word/2018/wordml/cex" xmlns:w16cid="http://schemas.microsoft.com/office/word/2016/wordml/cid" xmlns:w16="http://schemas.microsoft.com/office/word/2018/wordml" xmlns:w16du="http://schemas.microsoft.com/office/word/2023/wordml/word16du" xmlns:w16sdtdh="http://schemas.microsoft.com/office/word/2020/wordml/sdtdatahash" xmlns:w16sdtfl="http://schemas.microsoft.com/office/word/2024/wordml/sdtformatlock" xmlns:w16se="http://schemas.microsoft.com/office/word/2015/wordml/symex" xmlns:wpg="http://schemas.microsoft.com/office/word/2010/wordprocessingGroup" xmlns:wpi="http://schemas.microsoft.com/office/word/2010/wordprocessingInk" xmlns:wne="http://schemas.microsoft.com/office/word/2006/wordml" xmlns:wps="http://schemas.microsoft.com/office/word/2010/wordprocessingShape" mc:Ignorable="w14 w15 w16se w16cid w16 w16cex w16sdtdh w16sdtfl w16du wp14">
   <w:p>
     <w:pPr>
@@ -483,6 +528,12 @@
       <w:tab/>
     </w:r>
   </w:p>
+</w:hdr>
+</file>
+
+<file path=word/headerBlank.xml><?xml version="1.0" encoding="utf-8"?>
+<w:hdr xmlns:wpc="http://schemas.microsoft.com/office/word/2010/wordprocessingCanvas" xmlns:cx="http://schemas.microsoft.com/office/drawing/2014/chartex" xmlns:cx1="http://schemas.microsoft.com/office/drawing/2015/9/8/chartex" xmlns:cx2="http://schemas.microsoft.com/office/drawing/2015/10/21/chartex" xmlns:cx3="http://schemas.microsoft.com/office/drawing/2016/5/9/chartex" xmlns:cx4="http://schemas.microsoft.com/office/drawing/2016/5/10/chartex" xmlns:cx5="http://schemas.microsoft.com/office/drawing/2016/5/11/chartex" xmlns:cx6="http://schemas.microsoft.com/office/drawing/2016/5/12/chartex" xmlns:cx7="http://schemas.microsoft.com/office/drawing/2016/5/13/chartex" xmlns:cx8="http://schemas.microsoft.com/office/drawing/2016/5/14/chartex" xmlns:mc="http://schemas.openxmlformats.org/markup-compatibility/2006" xmlns:aink="http://schemas.microsoft.com/office/drawing/2016/ink" xmlns:am3d="http://schemas.microsoft.com/office/drawing/2017/model3d" xmlns:o="urn:schemas-microsoft-com:office:office" xmlns:oel="http://schemas.microsoft.com/office/2019/extlst" xmlns:r="http://schemas.openxmlformats.org/officeDocument/2006/relationships" xmlns:m="http://schemas.openxmlformats.org/officeDocument/2006/math" xmlns:v="urn:schemas-microsoft-com:vml" xmlns:wp14="http://schemas.microsoft.com/office/word/2010/wordprocessingDrawing" xmlns:wp="http://schemas.openxmlformats.org/drawingml/2006/wordprocessingDrawing" xmlns:w10="urn:schemas-microsoft-com:office:word" xmlns:w="http://schemas.openxmlformats.org/wordprocessingml/2006/main" xmlns:w14="http://schemas.microsoft.com/office/word/2010/wordml" xmlns:w15="http://schemas.microsoft.com/office/word/2012/wordml" xmlns:w16cex="http://schemas.microsoft.com/office/word/2018/wordml/cex" xmlns:w16cid="http://schemas.microsoft.com/office/word/2016/wordml/cid" xmlns:w16="http://schemas.microsoft.com/office/word/2018/wordml" xmlns:w16du="http://schemas.microsoft.com/office/word/2023/wordml/word16du" xmlns:w16sdtdh="http://schemas.microsoft.com/office/word/2020/wordml/sdtdatahash" xmlns:w16sdtfl="http://schemas.microsoft.com/office/word/2024/wordml/sdtformatlock" xmlns:w16se="http://schemas.microsoft.com/office/word/2015/wordml/symex" xmlns:wpg="http://schemas.microsoft.com/office/word/2010/wordprocessingGroup" xmlns:wpi="http://schemas.microsoft.com/office/word/2010/wordprocessingInk" xmlns:wne="http://schemas.microsoft.com/office/word/2006/wordml" xmlns:wps="http://schemas.microsoft.com/office/word/2010/wordprocessingShape" mc:Ignorable="w14 w15 w16se w16cid w16 w16cex w16sdtdh w16sdtfl w16du wp14">
+  <w:p/>
 </w:hdr>
 </file>
 

</xml_diff>

<commit_message>
fix(admin): memo header fill lines use the original's default-size runs
- Fill tabs after ส่วนราชการ / ที่ / วันที่ carry no explicit size like the original, so the dotted
  underline sits close to the text with tighter dots
- Keep the original's gap runs after the labels

Co-Authored-By: Claude Sonnet 5.5 <noreply@anthropic.com>
</commit_message>
<xml_diff>
--- a/public/templates/admin/word/memo.docx
+++ b/public/templates/admin/word/memo.docx
@@ -352,10 +352,19 @@
     </w:r>
     <w:r>
       <w:rPr>
-        <w:sz w:val="22"/>
-        <w:szCs w:val="22"/>
-      </w:rPr>
-      <w:t xml:space="preserve">  </w:t>
+        <w:rFonts w:ascii="TH SarabunIT๙" w:hAnsi="TH SarabunIT๙" w:cs="TH SarabunIT๙"/>
+        <w:u w:val="dotted"/>
+        <w:cs/>
+      </w:rPr>
+      <w:t xml:space="preserve"> </w:t>
+    </w:r>
+    <w:r>
+      <w:rPr>
+        <w:rFonts w:ascii="TH SarabunIT๙" w:hAnsi="TH SarabunIT๙" w:cs="TH SarabunIT๙" w:hint="cs"/>
+        <w:u w:val="dotted"/>
+        <w:cs/>
+      </w:rPr>
+      <w:t xml:space="preserve"> </w:t>
     </w:r>
     <w:r>
       <w:rPr>
@@ -370,8 +379,6 @@
     <w:r>
       <w:rPr>
         <w:rFonts w:ascii="TH SarabunIT๙" w:hAnsi="TH SarabunIT๙" w:cs="TH SarabunIT๙" w:hint="cs"/>
-        <w:sz w:val="32"/>
-        <w:szCs w:val="32"/>
         <w:u w:val="dotted"/>
         <w:cs/>
       </w:rPr>
@@ -403,10 +410,21 @@
     </w:r>
     <w:r>
       <w:rPr>
-        <w:sz w:val="22"/>
-        <w:szCs w:val="22"/>
-      </w:rPr>
-      <w:t xml:space="preserve">  </w:t>
+        <w:rFonts w:ascii="TH SarabunIT๙" w:hAnsi="TH SarabunIT๙" w:cs="TH SarabunIT๙"/>
+        <w:b/>
+        <w:bCs/>
+        <w:cs/>
+      </w:rPr>
+      <w:t xml:space="preserve"> </w:t>
+    </w:r>
+    <w:r>
+      <w:rPr>
+        <w:rFonts w:ascii="TH SarabunIT๙" w:hAnsi="TH SarabunIT๙" w:cs="TH SarabunIT๙" w:hint="cs"/>
+        <w:b/>
+        <w:bCs/>
+        <w:cs/>
+      </w:rPr>
+      <w:t xml:space="preserve"> </w:t>
     </w:r>
     <w:r>
       <w:rPr>
@@ -421,8 +439,6 @@
     <w:r>
       <w:rPr>
         <w:rFonts w:ascii="TH SarabunIT๙" w:hAnsi="TH SarabunIT๙" w:cs="TH SarabunIT๙" w:hint="cs"/>
-        <w:sz w:val="32"/>
-        <w:szCs w:val="32"/>
         <w:u w:val="dotted"/>
         <w:cs/>
       </w:rPr>
@@ -441,10 +457,20 @@
     </w:r>
     <w:r>
       <w:rPr>
-        <w:sz w:val="22"/>
-        <w:szCs w:val="22"/>
-      </w:rPr>
-      <w:t xml:space="preserve">  </w:t>
+        <w:rFonts w:ascii="TH SarabunIT๙" w:hAnsi="TH SarabunIT๙" w:cs="TH SarabunIT๙"/>
+        <w:u w:val="dotted"/>
+        <w:cs/>
+      </w:rPr>
+      <w:t xml:space="preserve"> </w:t>
+    </w:r>
+    <w:r>
+      <w:rPr>
+        <w:rFonts w:ascii="TH SarabunIT๙" w:hAnsi="TH SarabunIT๙" w:cs="TH SarabunIT๙"/>
+        <w:sz w:val="30"/>
+        <w:szCs w:val="30"/>
+        <w:u w:val="dotted"/>
+      </w:rPr>
+      <w:t xml:space="preserve"> </w:t>
     </w:r>
     <w:r>
       <w:rPr>
@@ -461,8 +487,6 @@
       <w:rPr>
         <w:rFonts w:ascii="TH SarabunIT๙" w:hAnsi="TH SarabunIT๙" w:cs="TH SarabunIT๙" w:hint="cs"/>
         <w:color w:val="000000" w:themeColor="text1"/>
-        <w:sz w:val="32"/>
-        <w:szCs w:val="32"/>
         <w:u w:val="dotted"/>
         <w:cs/>
       </w:rPr>

</xml_diff>

<commit_message>
fix(admin): memo uses Letter paper like the original Word file
The faculty's memo (1741) is set to Letter (12240 x 15840), not A4. Paper
size now comes from the shared template spec (memo = letter, others = A4)
and drives the HTML preview, PDF @page, Word template and fallback
builder, and the editor preview frame. The memo template keeps the
original page size and its header fill tab follows the Letter text width.

Co-Authored-By: Claude Sonnet 5.5 <noreply@anthropic.com>
</commit_message>
<xml_diff>
--- a/public/templates/admin/word/memo.docx
+++ b/public/templates/admin/word/memo.docx
@@ -71,7 +71,7 @@
           <w:headerReference w:type="first" r:id="rId7"/>
           <w:footerReference w:type="default" r:id="rId8"/>
           <w:footerReference w:type="first" r:id="rIdFtrFirst"/>
-          <w:pgSz w:w="11906" w:h="16838"/>
+          <w:pgSz w:w="12240" w:h="15840"/>
           <w:pgMar w:top="1418" w:right="1134" w:bottom="1276" w:left="1701" w:header="850" w:footer="850" w:gutter="0"/>
           <w:cols w:space="720"/>
           <w:titlePg/>
@@ -94,7 +94,7 @@
       <w:headerReference w:type="first" r:id="rId7"/>
       <w:footerReference w:type="default" r:id="rId8"/>
       <w:footerReference w:type="first" r:id="rIdFtrFirst"/>
-      <w:pgSz w:w="11906" w:h="16838"/>
+      <w:pgSz w:w="12240" w:h="15840"/>
       <w:pgMar w:top="1418" w:right="1134" w:bottom="1276" w:left="1701" w:header="850" w:footer="850" w:gutter="0"/>
       <w:cols w:space="720"/>
       <w:titlePg/>
@@ -328,7 +328,7 @@
   <w:p>
     <w:pPr>
       <w:tabs>
-        <w:tab w:val="left" w:pos="9070"/>
+        <w:tab w:val="left" w:pos="9404"/>
       </w:tabs>
       <w:spacing w:after="0" w:line="240" w:lineRule="auto"/>
       <w:jc w:val="thaiDistribute"/>
@@ -389,7 +389,7 @@
     <w:pPr>
       <w:tabs>
         <w:tab w:val="left" w:pos="3960"/>
-        <w:tab w:val="left" w:pos="9070"/>
+        <w:tab w:val="left" w:pos="9404"/>
       </w:tabs>
       <w:spacing w:after="0" w:line="240" w:lineRule="auto"/>
       <w:jc w:val="thaiDistribute"/>
@@ -497,7 +497,7 @@
     <w:pPr>
       <w:tabs>
         <w:tab w:val="left" w:pos="720"/>
-        <w:tab w:val="left" w:pos="9070"/>
+        <w:tab w:val="left" w:pos="9404"/>
       </w:tabs>
       <w:spacing w:after="0" w:line="240" w:lineRule="auto"/>
       <w:ind w:left="709" w:hanging="709"/>

</xml_diff>

<commit_message>
fix(admin): memo header fill lines end where the original's do
Measured from the faculty's Word-printed memo PDF, the header dotted
lines end 19.51 cm from the page edge (9360 twips from the text margin),
not at the right margin. The position now lives in the template spec
(headerFillTwips) and is used by both the Word template and the
fallback builder, which previously still used the A4 value 9070.

Co-Authored-By: Claude Opus 5.5 <noreply@anthropic.com>
</commit_message>
<xml_diff>
--- a/public/templates/admin/word/memo.docx
+++ b/public/templates/admin/word/memo.docx
@@ -328,7 +328,7 @@
   <w:p>
     <w:pPr>
       <w:tabs>
-        <w:tab w:val="left" w:pos="9404"/>
+        <w:tab w:val="left" w:pos="9360"/>
       </w:tabs>
       <w:spacing w:after="0" w:line="240" w:lineRule="auto"/>
       <w:jc w:val="thaiDistribute"/>
@@ -389,7 +389,7 @@
     <w:pPr>
       <w:tabs>
         <w:tab w:val="left" w:pos="3960"/>
-        <w:tab w:val="left" w:pos="9404"/>
+        <w:tab w:val="left" w:pos="9360"/>
       </w:tabs>
       <w:spacing w:after="0" w:line="240" w:lineRule="auto"/>
       <w:jc w:val="thaiDistribute"/>
@@ -497,7 +497,7 @@
     <w:pPr>
       <w:tabs>
         <w:tab w:val="left" w:pos="720"/>
-        <w:tab w:val="left" w:pos="9404"/>
+        <w:tab w:val="left" w:pos="9360"/>
       </w:tabs>
       <w:spacing w:after="0" w:line="240" w:lineRule="auto"/>
       <w:ind w:left="709" w:hanging="709"/>

</xml_diff>

<commit_message>
fix(admin): Word output renders Thai like the originals in Microsoft Word
Opening the generated files in Microsoft Word (not LibreOffice) showed two
problems the visual harness could not see:

- Body runs lacked <w:cs/>, so Word's Thai distributed alignment spread
  space between characters and detached vowels and tone marks. Runs now
  carry <w:cs/> like the original files (and rPr children follow the
  schema order sz, szCs, u, cs).
- The memo circular's date and its dotted line kept the red colour the
  sample file (ว 721) used as a draft marker; the issued document (ว 718)
  is black. Value and fill runs no longer inherit the sample's colour.

Co-Authored-By: Claude Opus 5.5 <noreply@anthropic.com>
</commit_message>
<xml_diff>
--- a/public/templates/admin/word/memo.docx
+++ b/public/templates/admin/word/memo.docx
@@ -19,6 +19,7 @@
           <w:rFonts w:ascii="TH SarabunIT๙" w:hAnsi="TH SarabunIT๙" w:cs="TH SarabunIT๙"/>
           <w:sz w:val="32"/>
           <w:szCs w:val="32"/>
+          <w:cs/>
         </w:rPr>
         <w:t xml:space="preserve">เรียน</w:t>
       </w:r>
@@ -27,6 +28,7 @@
           <w:rFonts w:ascii="TH SarabunIT๙" w:hAnsi="TH SarabunIT๙" w:cs="TH SarabunIT๙"/>
           <w:sz w:val="32"/>
           <w:szCs w:val="32"/>
+          <w:cs/>
         </w:rPr>
         <w:tab/>
       </w:r>
@@ -35,6 +37,7 @@
           <w:rFonts w:ascii="TH SarabunIT๙" w:hAnsi="TH SarabunIT๙" w:cs="TH SarabunIT๙"/>
           <w:sz w:val="32"/>
           <w:szCs w:val="32"/>
+          <w:cs/>
         </w:rPr>
         <w:t xml:space="preserve">{{to}}</w:t>
       </w:r>
@@ -475,7 +478,6 @@
     <w:r>
       <w:rPr>
         <w:rFonts w:ascii="TH SarabunIT๙" w:hAnsi="TH SarabunIT๙" w:cs="TH SarabunIT๙" w:hint="cs"/>
-        <w:color w:val="000000" w:themeColor="text1"/>
         <w:sz w:val="32"/>
         <w:szCs w:val="32"/>
         <w:u w:val="dotted"/>
@@ -486,7 +488,6 @@
     <w:r>
       <w:rPr>
         <w:rFonts w:ascii="TH SarabunIT๙" w:hAnsi="TH SarabunIT๙" w:cs="TH SarabunIT๙" w:hint="cs"/>
-        <w:color w:val="000000" w:themeColor="text1"/>
         <w:u w:val="dotted"/>
         <w:cs/>
       </w:rPr>

</xml_diff>